<commit_message>
Add Digicane UI, meeting-notes pipeline, SEO, and Flutter mobile client.
Co-authored-by: Cursor <cursoragent@cursor.com>
</commit_message>
<xml_diff>
--- a/docs/AI_Scrum_Master_End_User_Guide.docx
+++ b/docs/AI_Scrum_Master_End_User_Guide.docx
@@ -2823,6 +2823,68 @@
                 <w:sz w:val="18"/>
                 <w:szCs w:val="18"/>
               </w:rPr>
+              <w:t xml:space="preserve">Meeting Notes</w:t>
+            </w:r>
+          </w:p>
+        </w:tc>
+        <w:tc>
+          <w:tcPr>
+            <w:tcW w:type="dxa" w:w="3000"/>
+            <w:tcBorders>
+              <w:top w:val="single" w:color="CCCCCC" w:sz="4"/>
+              <w:left w:val="single" w:color="CCCCCC" w:sz="4"/>
+              <w:bottom w:val="single" w:color="CCCCCC" w:sz="4"/>
+              <w:right w:val="single" w:color="CCCCCC" w:sz="4"/>
+            </w:tcBorders>
+          </w:tcPr>
+          <w:p>
+            <w:r>
+              <w:rPr>
+                <w:sz w:val="18"/>
+                <w:szCs w:val="18"/>
+              </w:rPr>
+              <w:t xml:space="preserve">/dashboard/meeting-notes</w:t>
+            </w:r>
+          </w:p>
+        </w:tc>
+        <w:tc>
+          <w:tcPr>
+            <w:tcW w:type="dxa" w:w="3000"/>
+            <w:tcBorders>
+              <w:top w:val="single" w:color="CCCCCC" w:sz="4"/>
+              <w:left w:val="single" w:color="CCCCCC" w:sz="4"/>
+              <w:bottom w:val="single" w:color="CCCCCC" w:sz="4"/>
+              <w:right w:val="single" w:color="CCCCCC" w:sz="4"/>
+            </w:tcBorders>
+          </w:tcPr>
+          <w:p>
+            <w:r>
+              <w:rPr>
+                <w:sz w:val="18"/>
+                <w:szCs w:val="18"/>
+              </w:rPr>
+              <w:t xml:space="preserve">Business notes → summary → proposal → FR → backlog</w:t>
+            </w:r>
+          </w:p>
+        </w:tc>
+      </w:tr>
+      <w:tr>
+        <w:tc>
+          <w:tcPr>
+            <w:tcW w:type="dxa" w:w="3000"/>
+            <w:tcBorders>
+              <w:top w:val="single" w:color="CCCCCC" w:sz="4"/>
+              <w:left w:val="single" w:color="CCCCCC" w:sz="4"/>
+              <w:bottom w:val="single" w:color="CCCCCC" w:sz="4"/>
+              <w:right w:val="single" w:color="CCCCCC" w:sz="4"/>
+            </w:tcBorders>
+          </w:tcPr>
+          <w:p>
+            <w:r>
+              <w:rPr>
+                <w:sz w:val="18"/>
+                <w:szCs w:val="18"/>
+              </w:rPr>
               <w:t xml:space="preserve">Resources</w:t>
             </w:r>
           </w:p>
@@ -10025,6 +10087,90 @@
           </w:p>
         </w:tc>
       </w:tr>
+      <w:tr>
+        <w:tc>
+          <w:tcPr>
+            <w:tcW w:type="dxa" w:w="4500"/>
+            <w:tcBorders>
+              <w:top w:val="single" w:color="CCCCCC" w:sz="4"/>
+              <w:left w:val="single" w:color="CCCCCC" w:sz="4"/>
+              <w:bottom w:val="single" w:color="CCCCCC" w:sz="4"/>
+              <w:right w:val="single" w:color="CCCCCC" w:sz="4"/>
+            </w:tcBorders>
+          </w:tcPr>
+          <w:p>
+            <w:r>
+              <w:rPr>
+                <w:sz w:val="18"/>
+                <w:szCs w:val="18"/>
+              </w:rPr>
+              <w:t xml:space="preserve">AI summary/proposal fails</w:t>
+            </w:r>
+          </w:p>
+        </w:tc>
+        <w:tc>
+          <w:tcPr>
+            <w:tcW w:type="dxa" w:w="4500"/>
+            <w:tcBorders>
+              <w:top w:val="single" w:color="CCCCCC" w:sz="4"/>
+              <w:left w:val="single" w:color="CCCCCC" w:sz="4"/>
+              <w:bottom w:val="single" w:color="CCCCCC" w:sz="4"/>
+              <w:right w:val="single" w:color="CCCCCC" w:sz="4"/>
+            </w:tcBorders>
+          </w:tcPr>
+          <w:p>
+            <w:r>
+              <w:rPr>
+                <w:sz w:val="18"/>
+                <w:szCs w:val="18"/>
+              </w:rPr>
+              <w:t xml:space="preserve">Configure OPENAI_API_KEY; message explains when AI is unavailable</w:t>
+            </w:r>
+          </w:p>
+        </w:tc>
+      </w:tr>
+      <w:tr>
+        <w:tc>
+          <w:tcPr>
+            <w:tcW w:type="dxa" w:w="4500"/>
+            <w:tcBorders>
+              <w:top w:val="single" w:color="CCCCCC" w:sz="4"/>
+              <w:left w:val="single" w:color="CCCCCC" w:sz="4"/>
+              <w:bottom w:val="single" w:color="CCCCCC" w:sz="4"/>
+              <w:right w:val="single" w:color="CCCCCC" w:sz="4"/>
+            </w:tcBorders>
+          </w:tcPr>
+          <w:p>
+            <w:r>
+              <w:rPr>
+                <w:sz w:val="18"/>
+                <w:szCs w:val="18"/>
+              </w:rPr>
+              <w:t xml:space="preserve">Mobile cannot reach API</w:t>
+            </w:r>
+          </w:p>
+        </w:tc>
+        <w:tc>
+          <w:tcPr>
+            <w:tcW w:type="dxa" w:w="4500"/>
+            <w:tcBorders>
+              <w:top w:val="single" w:color="CCCCCC" w:sz="4"/>
+              <w:left w:val="single" w:color="CCCCCC" w:sz="4"/>
+              <w:bottom w:val="single" w:color="CCCCCC" w:sz="4"/>
+              <w:right w:val="single" w:color="CCCCCC" w:sz="4"/>
+            </w:tcBorders>
+          </w:tcPr>
+          <w:p>
+            <w:r>
+              <w:rPr>
+                <w:sz w:val="18"/>
+                <w:szCs w:val="18"/>
+              </w:rPr>
+              <w:t xml:space="preserve">Use http://10.0.2.2:3000 on Android emulator, or your PC LAN IP on a device</w:t>
+            </w:r>
+          </w:p>
+        </w:tc>
+      </w:tr>
     </w:tbl>
     <w:p>
       <w:pPr>
@@ -10049,7 +10195,7 @@
           <w:sz w:val="22"/>
           <w:szCs w:val="22"/>
         </w:rPr>
-        <w:t xml:space="preserve">10. Out of scope in this version</w:t>
+        <w:t xml:space="preserve">10. Meeting Notes (business discussions)</w:t>
       </w:r>
     </w:p>
     <w:p>
@@ -10061,7 +10207,403 @@
           <w:sz w:val="22"/>
           <w:szCs w:val="22"/>
         </w:rPr>
-        <w:t xml:space="preserve">Treat these as not available unless later released:</w:t>
+        <w:t xml:space="preserve">Menu: </w:t>
+      </w:r>
+      <w:r>
+        <w:rPr>
+          <w:b/>
+          <w:bCs/>
+          <w:sz w:val="22"/>
+          <w:szCs w:val="22"/>
+        </w:rPr>
+        <w:t xml:space="preserve">Meeting Notes</w:t>
+      </w:r>
+      <w:r>
+        <w:rPr>
+          <w:sz w:val="22"/>
+          <w:szCs w:val="22"/>
+        </w:rPr>
+        <w:t xml:space="preserve"> (</w:t>
+      </w:r>
+      <w:r>
+        <w:rPr>
+          <w:rFonts w:ascii="Consolas" w:cs="Consolas" w:eastAsia="Consolas" w:hAnsi="Consolas"/>
+          <w:sz w:val="20"/>
+          <w:szCs w:val="20"/>
+        </w:rPr>
+        <w:t xml:space="preserve">/dashboard/meeting-notes</w:t>
+      </w:r>
+      <w:r>
+        <w:rPr>
+          <w:sz w:val="22"/>
+          <w:szCs w:val="22"/>
+        </w:rPr>
+        <w:t xml:space="preserve">). Multi-tenant — notes belong to your company only.</w:t>
+      </w:r>
+    </w:p>
+    <w:p>
+      <w:pPr>
+        <w:pStyle w:val="ListParagraph"/>
+        <w:numPr>
+          <w:ilvl w:val="0"/>
+          <w:numId w:val="2"/>
+        </w:numPr>
+        <w:spacing w:after="60"/>
+      </w:pPr>
+      <w:r>
+        <w:rPr>
+          <w:b/>
+          <w:bCs/>
+          <w:sz w:val="22"/>
+          <w:szCs w:val="22"/>
+        </w:rPr>
+        <w:t xml:space="preserve">Save meeting note</w:t>
+      </w:r>
+      <w:r>
+        <w:rPr>
+          <w:sz w:val="22"/>
+          <w:szCs w:val="22"/>
+        </w:rPr>
+        <w:t xml:space="preserve"> — title, attendees, discussion notes.</w:t>
+      </w:r>
+    </w:p>
+    <w:p>
+      <w:pPr>
+        <w:pStyle w:val="ListParagraph"/>
+        <w:numPr>
+          <w:ilvl w:val="0"/>
+          <w:numId w:val="2"/>
+        </w:numPr>
+        <w:spacing w:after="60"/>
+      </w:pPr>
+      <w:r>
+        <w:rPr>
+          <w:sz w:val="22"/>
+          <w:szCs w:val="22"/>
+        </w:rPr>
+        <w:t xml:space="preserve">Open the note → </w:t>
+      </w:r>
+      <w:r>
+        <w:rPr>
+          <w:b/>
+          <w:bCs/>
+          <w:sz w:val="22"/>
+          <w:szCs w:val="22"/>
+        </w:rPr>
+        <w:t xml:space="preserve">Generate summary</w:t>
+      </w:r>
+      <w:r>
+        <w:rPr>
+          <w:sz w:val="22"/>
+          <w:szCs w:val="22"/>
+        </w:rPr>
+        <w:t xml:space="preserve"> (AI).</w:t>
+      </w:r>
+    </w:p>
+    <w:p>
+      <w:pPr>
+        <w:pStyle w:val="ListParagraph"/>
+        <w:numPr>
+          <w:ilvl w:val="0"/>
+          <w:numId w:val="2"/>
+        </w:numPr>
+        <w:spacing w:after="60"/>
+      </w:pPr>
+      <w:r>
+        <w:rPr>
+          <w:b/>
+          <w:bCs/>
+          <w:sz w:val="22"/>
+          <w:szCs w:val="22"/>
+        </w:rPr>
+        <w:t xml:space="preserve">Create proposal from summary</w:t>
+      </w:r>
+      <w:r>
+        <w:rPr>
+          <w:sz w:val="22"/>
+          <w:szCs w:val="22"/>
+        </w:rPr>
+        <w:t xml:space="preserve"> — rich-text (WYSIWYG) editor; </w:t>
+      </w:r>
+      <w:r>
+        <w:rPr>
+          <w:b/>
+          <w:bCs/>
+          <w:sz w:val="22"/>
+          <w:szCs w:val="22"/>
+        </w:rPr>
+        <w:t xml:space="preserve">Save proposal</w:t>
+      </w:r>
+      <w:r>
+        <w:rPr>
+          <w:sz w:val="22"/>
+          <w:szCs w:val="22"/>
+        </w:rPr>
+        <w:t xml:space="preserve">.</w:t>
+      </w:r>
+    </w:p>
+    <w:p>
+      <w:pPr>
+        <w:pStyle w:val="ListParagraph"/>
+        <w:numPr>
+          <w:ilvl w:val="0"/>
+          <w:numId w:val="2"/>
+        </w:numPr>
+        <w:spacing w:after="60"/>
+      </w:pPr>
+      <w:r>
+        <w:rPr>
+          <w:b/>
+          <w:bCs/>
+          <w:sz w:val="22"/>
+          <w:szCs w:val="22"/>
+        </w:rPr>
+        <w:t xml:space="preserve">Export proposal PDF</w:t>
+      </w:r>
+      <w:r>
+        <w:rPr>
+          <w:sz w:val="22"/>
+          <w:szCs w:val="22"/>
+        </w:rPr>
+        <w:t xml:space="preserve"> — opens a print-ready page (use browser Print → Save as PDF).</w:t>
+      </w:r>
+    </w:p>
+    <w:p>
+      <w:pPr>
+        <w:pStyle w:val="ListParagraph"/>
+        <w:numPr>
+          <w:ilvl w:val="0"/>
+          <w:numId w:val="2"/>
+        </w:numPr>
+        <w:spacing w:after="60"/>
+      </w:pPr>
+      <w:r>
+        <w:rPr>
+          <w:b/>
+          <w:bCs/>
+          <w:sz w:val="22"/>
+          <w:szCs w:val="22"/>
+        </w:rPr>
+        <w:t xml:space="preserve">Generate FRs</w:t>
+      </w:r>
+      <w:r>
+        <w:rPr>
+          <w:sz w:val="22"/>
+          <w:szCs w:val="22"/>
+        </w:rPr>
+        <w:t xml:space="preserve"> — functional requirements with kind hints (epic / feature / story / task / subtask).</w:t>
+      </w:r>
+    </w:p>
+    <w:p>
+      <w:pPr>
+        <w:pStyle w:val="ListParagraph"/>
+        <w:numPr>
+          <w:ilvl w:val="0"/>
+          <w:numId w:val="2"/>
+        </w:numPr>
+        <w:spacing w:after="60"/>
+      </w:pPr>
+      <w:r>
+        <w:rPr>
+          <w:b/>
+          <w:bCs/>
+          <w:sz w:val="22"/>
+          <w:szCs w:val="22"/>
+        </w:rPr>
+        <w:t xml:space="preserve">Push to project backlog</w:t>
+      </w:r>
+      <w:r>
+        <w:rPr>
+          <w:sz w:val="22"/>
+          <w:szCs w:val="22"/>
+        </w:rPr>
+        <w:t xml:space="preserve"> — selects a company project and creates hierarchy items. Existing backlog items are not deleted.</w:t>
+      </w:r>
+    </w:p>
+    <w:p>
+      <w:pPr>
+        <w:pStyle w:val="ListParagraph"/>
+        <w:numPr>
+          <w:ilvl w:val="0"/>
+          <w:numId w:val="2"/>
+        </w:numPr>
+        <w:spacing w:after="60"/>
+      </w:pPr>
+      <w:r>
+        <w:rPr>
+          <w:b/>
+          <w:bCs/>
+          <w:sz w:val="22"/>
+          <w:szCs w:val="22"/>
+        </w:rPr>
+        <w:t xml:space="preserve">Schedule meeting</w:t>
+      </w:r>
+      <w:r>
+        <w:rPr>
+          <w:sz w:val="22"/>
+          <w:szCs w:val="22"/>
+        </w:rPr>
+        <w:t xml:space="preserve"> — start/end/timezone/location → </w:t>
+      </w:r>
+      <w:r>
+        <w:rPr>
+          <w:b/>
+          <w:bCs/>
+          <w:sz w:val="22"/>
+          <w:szCs w:val="22"/>
+        </w:rPr>
+        <w:t xml:space="preserve">Download ICS</w:t>
+      </w:r>
+      <w:r>
+        <w:rPr>
+          <w:sz w:val="22"/>
+          <w:szCs w:val="22"/>
+        </w:rPr>
+        <w:t xml:space="preserve"> for any calendar app. Google Calendar OAuth is optional via env and is not required.</w:t>
+      </w:r>
+    </w:p>
+    <w:p>
+      <w:pPr>
+        <w:pBdr>
+          <w:bottom w:val="single" w:color="999999" w:sz="6" w:space="8"/>
+        </w:pBdr>
+        <w:spacing w:after="200" w:before="120"/>
+      </w:pPr>
+    </w:p>
+    <w:p>
+      <w:pPr>
+        <w:pStyle w:val="Heading2"/>
+        <w:spacing w:after="120" w:before="240"/>
+      </w:pPr>
+      <w:r>
+        <w:rPr>
+          <w:sz w:val="22"/>
+          <w:szCs w:val="22"/>
+        </w:rPr>
+        <w:t xml:space="preserve">11. Public site (SEO / AEO / GEO)</w:t>
+      </w:r>
+    </w:p>
+    <w:p>
+      <w:pPr>
+        <w:spacing w:after="120"/>
+      </w:pPr>
+      <w:r>
+        <w:rPr>
+          <w:sz w:val="22"/>
+          <w:szCs w:val="22"/>
+        </w:rPr>
+        <w:t xml:space="preserve">Unauthenticated visitors see a public home page and FAQ (answer-engine friendly). Staff still sign in at </w:t>
+      </w:r>
+      <w:r>
+        <w:rPr>
+          <w:rFonts w:ascii="Consolas" w:cs="Consolas" w:eastAsia="Consolas" w:hAnsi="Consolas"/>
+          <w:sz w:val="20"/>
+          <w:szCs w:val="20"/>
+        </w:rPr>
+        <w:t xml:space="preserve">/login</w:t>
+      </w:r>
+      <w:r>
+        <w:rPr>
+          <w:sz w:val="22"/>
+          <w:szCs w:val="22"/>
+        </w:rPr>
+        <w:t xml:space="preserve">. Authenticated users hitting </w:t>
+      </w:r>
+      <w:r>
+        <w:rPr>
+          <w:rFonts w:ascii="Consolas" w:cs="Consolas" w:eastAsia="Consolas" w:hAnsi="Consolas"/>
+          <w:sz w:val="20"/>
+          <w:szCs w:val="20"/>
+        </w:rPr>
+        <w:t xml:space="preserve">/</w:t>
+      </w:r>
+      <w:r>
+        <w:rPr>
+          <w:sz w:val="22"/>
+          <w:szCs w:val="22"/>
+        </w:rPr>
+        <w:t xml:space="preserve"> go to the dashboard. Private </w:t>
+      </w:r>
+      <w:r>
+        <w:rPr>
+          <w:rFonts w:ascii="Consolas" w:cs="Consolas" w:eastAsia="Consolas" w:hAnsi="Consolas"/>
+          <w:sz w:val="20"/>
+          <w:szCs w:val="20"/>
+        </w:rPr>
+        <w:t xml:space="preserve">/dashboard</w:t>
+      </w:r>
+      <w:r>
+        <w:rPr>
+          <w:sz w:val="22"/>
+          <w:szCs w:val="22"/>
+        </w:rPr>
+        <w:t xml:space="preserve"> routes are not indexed. See also </w:t>
+      </w:r>
+      <w:r>
+        <w:rPr>
+          <w:rFonts w:ascii="Consolas" w:cs="Consolas" w:eastAsia="Consolas" w:hAnsi="Consolas"/>
+          <w:sz w:val="20"/>
+          <w:szCs w:val="20"/>
+        </w:rPr>
+        <w:t xml:space="preserve">/llms.txt</w:t>
+      </w:r>
+      <w:r>
+        <w:rPr>
+          <w:sz w:val="22"/>
+          <w:szCs w:val="22"/>
+        </w:rPr>
+        <w:t xml:space="preserve">, </w:t>
+      </w:r>
+      <w:r>
+        <w:rPr>
+          <w:rFonts w:ascii="Consolas" w:cs="Consolas" w:eastAsia="Consolas" w:hAnsi="Consolas"/>
+          <w:sz w:val="20"/>
+          <w:szCs w:val="20"/>
+        </w:rPr>
+        <w:t xml:space="preserve">/sitemap.xml</w:t>
+      </w:r>
+      <w:r>
+        <w:rPr>
+          <w:sz w:val="22"/>
+          <w:szCs w:val="22"/>
+        </w:rPr>
+        <w:t xml:space="preserve">, and </w:t>
+      </w:r>
+      <w:r>
+        <w:rPr>
+          <w:rFonts w:ascii="Consolas" w:cs="Consolas" w:eastAsia="Consolas" w:hAnsi="Consolas"/>
+          <w:sz w:val="20"/>
+          <w:szCs w:val="20"/>
+        </w:rPr>
+        <w:t xml:space="preserve">/robots.txt</w:t>
+      </w:r>
+      <w:r>
+        <w:rPr>
+          <w:sz w:val="22"/>
+          <w:szCs w:val="22"/>
+        </w:rPr>
+        <w:t xml:space="preserve">.</w:t>
+      </w:r>
+    </w:p>
+    <w:p>
+      <w:pPr>
+        <w:pBdr>
+          <w:bottom w:val="single" w:color="999999" w:sz="6" w:space="8"/>
+        </w:pBdr>
+        <w:spacing w:after="200" w:before="120"/>
+      </w:pPr>
+    </w:p>
+    <w:p>
+      <w:pPr>
+        <w:pStyle w:val="Heading2"/>
+        <w:spacing w:after="120" w:before="240"/>
+      </w:pPr>
+      <w:r>
+        <w:rPr>
+          <w:sz w:val="22"/>
+          <w:szCs w:val="22"/>
+        </w:rPr>
+        <w:t xml:space="preserve">12. Mobile app (Flutter)</w:t>
       </w:r>
     </w:p>
     <w:p>
@@ -10078,7 +10620,23 @@
           <w:sz w:val="22"/>
           <w:szCs w:val="22"/>
         </w:rPr>
-        <w:t xml:space="preserve">Excel / CSV status upload</w:t>
+        <w:t xml:space="preserve">Digicane light theme and a </w:t>
+      </w:r>
+      <w:r>
+        <w:rPr>
+          <w:b/>
+          <w:bCs/>
+          <w:sz w:val="22"/>
+          <w:szCs w:val="22"/>
+        </w:rPr>
+        <w:t xml:space="preserve">collapsible menu</w:t>
+      </w:r>
+      <w:r>
+        <w:rPr>
+          <w:sz w:val="22"/>
+          <w:szCs w:val="22"/>
+        </w:rPr>
+        <w:t xml:space="preserve"> (drawer) from the top-left.</w:t>
       </w:r>
     </w:p>
     <w:p>
@@ -10095,7 +10653,7 @@
           <w:sz w:val="22"/>
           <w:szCs w:val="22"/>
         </w:rPr>
-        <w:t xml:space="preserve">Jira / Azure DevOps sync</w:t>
+        <w:t xml:space="preserve">Sign in with the same email/password as the web app (separate mobile token API — web sessions unchanged).</w:t>
       </w:r>
     </w:p>
     <w:p>
@@ -10112,7 +10670,7 @@
           <w:sz w:val="22"/>
           <w:szCs w:val="22"/>
         </w:rPr>
-        <w:t xml:space="preserve">Free-form email reply parsing (email delivers the link only)</w:t>
+        <w:t xml:space="preserve">Drawer menus follow Feature access for your role.</w:t>
       </w:r>
     </w:p>
     <w:p>
@@ -10129,7 +10687,7 @@
           <w:sz w:val="22"/>
           <w:szCs w:val="22"/>
         </w:rPr>
-        <w:t xml:space="preserve">Slack / SMS notifications</w:t>
+        <w:t xml:space="preserve">Overview KPIs, Projects, Meeting Notes (list/create). Full AI proposal/FR pipeline remains on the web detail page.</w:t>
       </w:r>
     </w:p>
     <w:p>
@@ -10146,7 +10704,103 @@
           <w:sz w:val="22"/>
           <w:szCs w:val="22"/>
         </w:rPr>
-        <w:t xml:space="preserve">Native mobile apps</w:t>
+        <w:t xml:space="preserve">Install Android: see </w:t>
+      </w:r>
+      <w:r>
+        <w:rPr>
+          <w:rFonts w:ascii="Consolas" w:cs="Consolas" w:eastAsia="Consolas" w:hAnsi="Consolas"/>
+          <w:sz w:val="20"/>
+          <w:szCs w:val="20"/>
+        </w:rPr>
+        <w:t xml:space="preserve">mobile/README.md</w:t>
+      </w:r>
+      <w:r>
+        <w:rPr>
+          <w:sz w:val="22"/>
+          <w:szCs w:val="22"/>
+        </w:rPr>
+        <w:t xml:space="preserve"> and </w:t>
+      </w:r>
+      <w:r>
+        <w:rPr>
+          <w:rFonts w:ascii="Consolas" w:cs="Consolas" w:eastAsia="Consolas" w:hAnsi="Consolas"/>
+          <w:sz w:val="20"/>
+          <w:szCs w:val="20"/>
+        </w:rPr>
+        <w:t xml:space="preserve">mobile/build/app/outputs/flutter-apk/app-release.apk</w:t>
+      </w:r>
+      <w:r>
+        <w:rPr>
+          <w:sz w:val="22"/>
+          <w:szCs w:val="22"/>
+        </w:rPr>
+        <w:t xml:space="preserve"> after release build.</w:t>
+      </w:r>
+    </w:p>
+    <w:p>
+      <w:pPr>
+        <w:pBdr>
+          <w:bottom w:val="single" w:color="999999" w:sz="6" w:space="8"/>
+        </w:pBdr>
+        <w:spacing w:after="200" w:before="120"/>
+      </w:pPr>
+    </w:p>
+    <w:p>
+      <w:pPr>
+        <w:pStyle w:val="Heading2"/>
+        <w:spacing w:after="120" w:before="240"/>
+      </w:pPr>
+      <w:r>
+        <w:rPr>
+          <w:sz w:val="22"/>
+          <w:szCs w:val="22"/>
+        </w:rPr>
+        <w:t xml:space="preserve">13. UI feedback and errors</w:t>
+      </w:r>
+    </w:p>
+    <w:p>
+      <w:pPr>
+        <w:spacing w:after="120"/>
+      </w:pPr>
+      <w:r>
+        <w:rPr>
+          <w:sz w:val="22"/>
+          <w:szCs w:val="22"/>
+        </w:rPr>
+        <w:t xml:space="preserve">Buttons, inputs, and nav links show hover, focus, and active states. Errors appear as short human-readable banners (permission, network, AI unavailable, validation) instead of technical stack traces.</w:t>
+      </w:r>
+    </w:p>
+    <w:p>
+      <w:pPr>
+        <w:pBdr>
+          <w:bottom w:val="single" w:color="999999" w:sz="6" w:space="8"/>
+        </w:pBdr>
+        <w:spacing w:after="200" w:before="120"/>
+      </w:pPr>
+    </w:p>
+    <w:p>
+      <w:pPr>
+        <w:pStyle w:val="Heading2"/>
+        <w:spacing w:after="120" w:before="240"/>
+      </w:pPr>
+      <w:r>
+        <w:rPr>
+          <w:sz w:val="22"/>
+          <w:szCs w:val="22"/>
+        </w:rPr>
+        <w:t xml:space="preserve">14. Out of scope in this version</w:t>
+      </w:r>
+    </w:p>
+    <w:p>
+      <w:pPr>
+        <w:spacing w:after="120"/>
+      </w:pPr>
+      <w:r>
+        <w:rPr>
+          <w:sz w:val="22"/>
+          <w:szCs w:val="22"/>
+        </w:rPr>
+        <w:t xml:space="preserve">Treat these as not available unless later released:</w:t>
       </w:r>
     </w:p>
     <w:p>
@@ -10163,7 +10817,92 @@
           <w:sz w:val="22"/>
           <w:szCs w:val="22"/>
         </w:rPr>
+        <w:t xml:space="preserve">Excel / CSV status upload</w:t>
+      </w:r>
+    </w:p>
+    <w:p>
+      <w:pPr>
+        <w:pStyle w:val="ListParagraph"/>
+        <w:numPr>
+          <w:ilvl w:val="0"/>
+          <w:numId w:val="1"/>
+        </w:numPr>
+        <w:spacing w:after="60"/>
+      </w:pPr>
+      <w:r>
+        <w:rPr>
+          <w:sz w:val="22"/>
+          <w:szCs w:val="22"/>
+        </w:rPr>
+        <w:t xml:space="preserve">Jira / Azure DevOps sync</w:t>
+      </w:r>
+    </w:p>
+    <w:p>
+      <w:pPr>
+        <w:pStyle w:val="ListParagraph"/>
+        <w:numPr>
+          <w:ilvl w:val="0"/>
+          <w:numId w:val="1"/>
+        </w:numPr>
+        <w:spacing w:after="60"/>
+      </w:pPr>
+      <w:r>
+        <w:rPr>
+          <w:sz w:val="22"/>
+          <w:szCs w:val="22"/>
+        </w:rPr>
+        <w:t xml:space="preserve">Free-form email reply parsing (email delivers the link only)</w:t>
+      </w:r>
+    </w:p>
+    <w:p>
+      <w:pPr>
+        <w:pStyle w:val="ListParagraph"/>
+        <w:numPr>
+          <w:ilvl w:val="0"/>
+          <w:numId w:val="1"/>
+        </w:numPr>
+        <w:spacing w:after="60"/>
+      </w:pPr>
+      <w:r>
+        <w:rPr>
+          <w:sz w:val="22"/>
+          <w:szCs w:val="22"/>
+        </w:rPr>
+        <w:t xml:space="preserve">Slack / SMS notifications</w:t>
+      </w:r>
+    </w:p>
+    <w:p>
+      <w:pPr>
+        <w:pStyle w:val="ListParagraph"/>
+        <w:numPr>
+          <w:ilvl w:val="0"/>
+          <w:numId w:val="1"/>
+        </w:numPr>
+        <w:spacing w:after="60"/>
+      </w:pPr>
+      <w:r>
+        <w:rPr>
+          <w:sz w:val="22"/>
+          <w:szCs w:val="22"/>
+        </w:rPr>
         <w:t xml:space="preserve">Public self-signup or password reset UI</w:t>
+      </w:r>
+    </w:p>
+    <w:p>
+      <w:pPr>
+        <w:pStyle w:val="ListParagraph"/>
+        <w:numPr>
+          <w:ilvl w:val="0"/>
+          <w:numId w:val="1"/>
+        </w:numPr>
+        <w:spacing w:after="60"/>
+      </w:pPr>
+      <w:r>
+        <w:rPr>
+          <w:sz w:val="22"/>
+          <w:szCs w:val="22"/>
+        </w:rPr>
+        <w:t xml:space="preserve">Play Store / App Store listing submission (APK is sideload-ready)</w:t>
       </w:r>
     </w:p>
     <w:p>
@@ -10184,7 +10923,7 @@
           <w:sz w:val="22"/>
           <w:szCs w:val="22"/>
         </w:rPr>
-        <w:t xml:space="preserve">11. Quick reference</w:t>
+        <w:t xml:space="preserve">15. Quick reference</w:t>
       </w:r>
     </w:p>
     <w:p>
@@ -10197,7 +10936,7 @@
           <w:sz w:val="22"/>
           <w:szCs w:val="22"/>
         </w:rPr>
-        <w:t xml:space="preserve">11.1 Agent jobs</w:t>
+        <w:t xml:space="preserve">15.1 Agent jobs</w:t>
       </w:r>
     </w:p>
     <w:tbl>
@@ -10611,7 +11350,7 @@
           <w:sz w:val="22"/>
           <w:szCs w:val="22"/>
         </w:rPr>
-        <w:t xml:space="preserve">11.2 Default menus by role</w:t>
+        <w:t xml:space="preserve">15.2 Default menus by role</w:t>
       </w:r>
     </w:p>
     <w:tbl>
@@ -10839,7 +11578,7 @@
                 <w:sz w:val="18"/>
                 <w:szCs w:val="18"/>
               </w:rPr>
-              <w:t xml:space="preserve">Delivery menus + edit delivery (no agent/users/settings by default)</w:t>
+              <w:t xml:space="preserve">Delivery menus + edit delivery + meeting notes (no agent/users/settings by default)</w:t>
             </w:r>
           </w:p>
         </w:tc>
@@ -10881,7 +11620,7 @@
                 <w:sz w:val="18"/>
                 <w:szCs w:val="18"/>
               </w:rPr>
-              <w:t xml:space="preserve">Delivery menus + agent + run agent</w:t>
+              <w:t xml:space="preserve">Delivery menus + meeting notes + agent + run agent</w:t>
             </w:r>
           </w:p>
         </w:tc>
@@ -10923,7 +11662,7 @@
                 <w:sz w:val="18"/>
                 <w:szCs w:val="18"/>
               </w:rPr>
-              <w:t xml:space="preserve">Overview, Projects, Epic/Story/Task, Work breakdown, Daily status</w:t>
+              <w:t xml:space="preserve">Overview, Projects, Epic/Story/Task, Work breakdown, Daily status, Meeting Notes</w:t>
             </w:r>
           </w:p>
         </w:tc>
@@ -10944,7 +11683,7 @@
           <w:sz w:val="22"/>
           <w:szCs w:val="22"/>
         </w:rPr>
-        <w:t xml:space="preserve">11.3 Related documentation</w:t>
+        <w:t xml:space="preserve">15.3 Related documentation</w:t>
       </w:r>
     </w:p>
     <w:tbl>
@@ -11088,7 +11827,7 @@
                 <w:sz w:val="18"/>
                 <w:szCs w:val="18"/>
               </w:rPr>
-              <w:t xml:space="preserve">Cron, env vars, production deploy</w:t>
+              <w:t xml:space="preserve">Cron, env vars, production deploy, DB backup before migrate</w:t>
             </w:r>
           </w:p>
         </w:tc>
@@ -11131,6 +11870,48 @@
                 <w:szCs w:val="18"/>
               </w:rPr>
               <w:t xml:space="preserve">Local Docker Desktop stack</w:t>
+            </w:r>
+          </w:p>
+        </w:tc>
+      </w:tr>
+      <w:tr>
+        <w:tc>
+          <w:tcPr>
+            <w:tcW w:type="dxa" w:w="4500"/>
+            <w:tcBorders>
+              <w:top w:val="single" w:color="CCCCCC" w:sz="4"/>
+              <w:left w:val="single" w:color="CCCCCC" w:sz="4"/>
+              <w:bottom w:val="single" w:color="CCCCCC" w:sz="4"/>
+              <w:right w:val="single" w:color="CCCCCC" w:sz="4"/>
+            </w:tcBorders>
+          </w:tcPr>
+          <w:p>
+            <w:r>
+              <w:rPr>
+                <w:sz w:val="18"/>
+                <w:szCs w:val="18"/>
+              </w:rPr>
+              <w:t xml:space="preserve">mobile/README.md</w:t>
+            </w:r>
+          </w:p>
+        </w:tc>
+        <w:tc>
+          <w:tcPr>
+            <w:tcW w:type="dxa" w:w="4500"/>
+            <w:tcBorders>
+              <w:top w:val="single" w:color="CCCCCC" w:sz="4"/>
+              <w:left w:val="single" w:color="CCCCCC" w:sz="4"/>
+              <w:bottom w:val="single" w:color="CCCCCC" w:sz="4"/>
+              <w:right w:val="single" w:color="CCCCCC" w:sz="4"/>
+            </w:tcBorders>
+          </w:tcPr>
+          <w:p>
+            <w:r>
+              <w:rPr>
+                <w:sz w:val="18"/>
+                <w:szCs w:val="18"/>
+              </w:rPr>
+              <w:t xml:space="preserve">Flutter run / Android APK</w:t>
             </w:r>
           </w:p>
         </w:tc>

</xml_diff>

<commit_message>
Add Meet/Teams auto-provision, mobile pipeline, and Billing/GTS/Agent screens.
Schedule uses date/time dropdowns; soft-fail Google/Graph links; Flutter Quill pipeline plus billing/GTS/agent APIs stay additive.

Co-authored-by: Cursor <cursoragent@cursor.com>
</commit_message>
<xml_diff>
--- a/docs/AI_Scrum_Master_End_User_Guide.docx
+++ b/docs/AI_Scrum_Master_End_User_Guide.docx
@@ -90,6 +90,28 @@
           <w:szCs w:val="20"/>
         </w:rPr>
         <w:t xml:space="preserve">AI_Scrum_Master_End_User_Guide.docx</w:t>
+      </w:r>
+      <w:r>
+        <w:rPr>
+          <w:sz w:val="22"/>
+          <w:szCs w:val="22"/>
+        </w:rPr>
+        <w:t xml:space="preserve"> (if that file is locked in Word, use </w:t>
+      </w:r>
+      <w:r>
+        <w:rPr>
+          <w:rFonts w:ascii="Consolas" w:cs="Consolas" w:eastAsia="Consolas" w:hAnsi="Consolas"/>
+          <w:sz w:val="20"/>
+          <w:szCs w:val="20"/>
+        </w:rPr>
+        <w:t xml:space="preserve">AI_Scrum_Master_End_User_Guide_updated.docx</w:t>
+      </w:r>
+      <w:r>
+        <w:rPr>
+          <w:sz w:val="22"/>
+          <w:szCs w:val="22"/>
+        </w:rPr>
+        <w:t xml:space="preserve">).</w:t>
       </w:r>
     </w:p>
     <w:p>
@@ -10166,7 +10188,7 @@
                 <w:sz w:val="18"/>
                 <w:szCs w:val="18"/>
               </w:rPr>
-              <w:t xml:space="preserve">Use http://10.0.2.2:3000 on Android emulator, or your PC LAN IP on a device</w:t>
+              <w:t xml:space="preserve">App uses the production Railway URL by default; check internet / VPN</w:t>
             </w:r>
           </w:p>
         </w:tc>
@@ -10243,6 +10265,47 @@
     </w:p>
     <w:p>
       <w:pPr>
+        <w:pStyle w:val="Heading3"/>
+        <w:spacing w:after="120" w:before="240"/>
+      </w:pPr>
+      <w:r>
+        <w:rPr>
+          <w:sz w:val="22"/>
+          <w:szCs w:val="22"/>
+        </w:rPr>
+        <w:t xml:space="preserve">How the conversion pipeline works</w:t>
+      </w:r>
+    </w:p>
+    <w:p>
+      <w:pPr>
+        <w:spacing w:after="120"/>
+      </w:pPr>
+      <w:r>
+        <w:rPr>
+          <w:sz w:val="22"/>
+          <w:szCs w:val="22"/>
+        </w:rPr>
+        <w:t xml:space="preserve">On the list page you will see a </w:t>
+      </w:r>
+      <w:r>
+        <w:rPr>
+          <w:b/>
+          <w:bCs/>
+          <w:sz w:val="22"/>
+          <w:szCs w:val="22"/>
+        </w:rPr>
+        <w:t xml:space="preserve">How it works</w:t>
+      </w:r>
+      <w:r>
+        <w:rPr>
+          <w:sz w:val="22"/>
+          <w:szCs w:val="22"/>
+        </w:rPr>
+        <w:t xml:space="preserve"> strip:</w:t>
+      </w:r>
+    </w:p>
+    <w:p>
+      <w:pPr>
         <w:pStyle w:val="ListParagraph"/>
         <w:numPr>
           <w:ilvl w:val="0"/>
@@ -10252,6 +10315,220 @@
       </w:pPr>
       <w:r>
         <w:rPr>
+          <w:sz w:val="22"/>
+          <w:szCs w:val="22"/>
+        </w:rPr>
+        <w:t xml:space="preserve">Capture notes  </w:t>
+      </w:r>
+    </w:p>
+    <w:p>
+      <w:pPr>
+        <w:pStyle w:val="ListParagraph"/>
+        <w:numPr>
+          <w:ilvl w:val="0"/>
+          <w:numId w:val="2"/>
+        </w:numPr>
+        <w:spacing w:after="60"/>
+      </w:pPr>
+      <w:r>
+        <w:rPr>
+          <w:sz w:val="22"/>
+          <w:szCs w:val="22"/>
+        </w:rPr>
+        <w:t xml:space="preserve">Generate summary  </w:t>
+      </w:r>
+    </w:p>
+    <w:p>
+      <w:pPr>
+        <w:pStyle w:val="ListParagraph"/>
+        <w:numPr>
+          <w:ilvl w:val="0"/>
+          <w:numId w:val="2"/>
+        </w:numPr>
+        <w:spacing w:after="60"/>
+      </w:pPr>
+      <w:r>
+        <w:rPr>
+          <w:sz w:val="22"/>
+          <w:szCs w:val="22"/>
+        </w:rPr>
+        <w:t xml:space="preserve">Create proposal  </w:t>
+      </w:r>
+    </w:p>
+    <w:p>
+      <w:pPr>
+        <w:pStyle w:val="ListParagraph"/>
+        <w:numPr>
+          <w:ilvl w:val="0"/>
+          <w:numId w:val="2"/>
+        </w:numPr>
+        <w:spacing w:after="60"/>
+      </w:pPr>
+      <w:r>
+        <w:rPr>
+          <w:sz w:val="22"/>
+          <w:szCs w:val="22"/>
+        </w:rPr>
+        <w:t xml:space="preserve">Generate FRs  </w:t>
+      </w:r>
+    </w:p>
+    <w:p>
+      <w:pPr>
+        <w:pStyle w:val="ListParagraph"/>
+        <w:numPr>
+          <w:ilvl w:val="0"/>
+          <w:numId w:val="2"/>
+        </w:numPr>
+        <w:spacing w:after="60"/>
+      </w:pPr>
+      <w:r>
+        <w:rPr>
+          <w:sz w:val="22"/>
+          <w:szCs w:val="22"/>
+        </w:rPr>
+        <w:t xml:space="preserve">Push to backlog</w:t>
+      </w:r>
+    </w:p>
+    <w:p>
+      <w:pPr>
+        <w:spacing w:after="120"/>
+      </w:pPr>
+      <w:r>
+        <w:rPr>
+          <w:sz w:val="22"/>
+          <w:szCs w:val="22"/>
+        </w:rPr>
+        <w:t xml:space="preserve">AI steps (2–4) need </w:t>
+      </w:r>
+      <w:r>
+        <w:rPr>
+          <w:rFonts w:ascii="Consolas" w:cs="Consolas" w:eastAsia="Consolas" w:hAnsi="Consolas"/>
+          <w:sz w:val="20"/>
+          <w:szCs w:val="20"/>
+        </w:rPr>
+        <w:t xml:space="preserve">OPENAI_API_KEY</w:t>
+      </w:r>
+      <w:r>
+        <w:rPr>
+          <w:sz w:val="22"/>
+          <w:szCs w:val="22"/>
+        </w:rPr>
+        <w:t xml:space="preserve"> configured on the server. If a button fails, the page shows a human-readable error.</w:t>
+      </w:r>
+    </w:p>
+    <w:p>
+      <w:pPr>
+        <w:pStyle w:val="Heading3"/>
+        <w:spacing w:after="120" w:before="240"/>
+      </w:pPr>
+      <w:r>
+        <w:rPr>
+          <w:sz w:val="22"/>
+          <w:szCs w:val="22"/>
+        </w:rPr>
+        <w:t xml:space="preserve">Step-by-step</w:t>
+      </w:r>
+    </w:p>
+    <w:p>
+      <w:pPr>
+        <w:pStyle w:val="ListParagraph"/>
+        <w:numPr>
+          <w:ilvl w:val="0"/>
+          <w:numId w:val="2"/>
+        </w:numPr>
+        <w:spacing w:after="60"/>
+      </w:pPr>
+      <w:r>
+        <w:rPr>
+          <w:sz w:val="22"/>
+          <w:szCs w:val="22"/>
+        </w:rPr>
+        <w:t xml:space="preserve">Open </w:t>
+      </w:r>
+      <w:r>
+        <w:rPr>
+          <w:b/>
+          <w:bCs/>
+          <w:sz w:val="22"/>
+          <w:szCs w:val="22"/>
+        </w:rPr>
+        <w:t xml:space="preserve">Meeting Notes</w:t>
+      </w:r>
+      <w:r>
+        <w:rPr>
+          <w:sz w:val="22"/>
+          <w:szCs w:val="22"/>
+        </w:rPr>
+        <w:t xml:space="preserve">.</w:t>
+      </w:r>
+    </w:p>
+    <w:p>
+      <w:pPr>
+        <w:pStyle w:val="ListParagraph"/>
+        <w:numPr>
+          <w:ilvl w:val="0"/>
+          <w:numId w:val="2"/>
+        </w:numPr>
+        <w:spacing w:after="60"/>
+      </w:pPr>
+      <w:r>
+        <w:rPr>
+          <w:sz w:val="22"/>
+          <w:szCs w:val="22"/>
+        </w:rPr>
+        <w:t xml:space="preserve">Under </w:t>
+      </w:r>
+      <w:r>
+        <w:rPr>
+          <w:b/>
+          <w:bCs/>
+          <w:sz w:val="22"/>
+          <w:szCs w:val="22"/>
+        </w:rPr>
+        <w:t xml:space="preserve">New business discussion</w:t>
+      </w:r>
+      <w:r>
+        <w:rPr>
+          <w:sz w:val="22"/>
+          <w:szCs w:val="22"/>
+        </w:rPr>
+        <w:t xml:space="preserve">, enter a title and attendees.</w:t>
+      </w:r>
+    </w:p>
+    <w:p>
+      <w:pPr>
+        <w:pStyle w:val="ListParagraph"/>
+        <w:numPr>
+          <w:ilvl w:val="0"/>
+          <w:numId w:val="2"/>
+        </w:numPr>
+        <w:spacing w:after="60"/>
+      </w:pPr>
+      <w:r>
+        <w:rPr>
+          <w:sz w:val="22"/>
+          <w:szCs w:val="22"/>
+        </w:rPr>
+        <w:t xml:space="preserve">Enter discussion / requirement notes in the </w:t>
+      </w:r>
+      <w:r>
+        <w:rPr>
+          <w:b/>
+          <w:bCs/>
+          <w:sz w:val="22"/>
+          <w:szCs w:val="22"/>
+        </w:rPr>
+        <w:t xml:space="preserve">rich-text (WYSIWYG) editor</w:t>
+      </w:r>
+      <w:r>
+        <w:rPr>
+          <w:sz w:val="22"/>
+          <w:szCs w:val="22"/>
+        </w:rPr>
+        <w:t xml:space="preserve"> (bold, headings, lists, links). Select </w:t>
+      </w:r>
+      <w:r>
+        <w:rPr>
           <w:b/>
           <w:bCs/>
           <w:sz w:val="22"/>
@@ -10264,7 +10541,7 @@
           <w:sz w:val="22"/>
           <w:szCs w:val="22"/>
         </w:rPr>
-        <w:t xml:space="preserve"> — title, attendees, discussion notes.</w:t>
+        <w:t xml:space="preserve">.</w:t>
       </w:r>
     </w:p>
     <w:p>
@@ -10281,7 +10558,56 @@
           <w:sz w:val="22"/>
           <w:szCs w:val="22"/>
         </w:rPr>
-        <w:t xml:space="preserve">Open the note → </w:t>
+        <w:t xml:space="preserve">You land on the note detail page. At the top, the </w:t>
+      </w:r>
+      <w:r>
+        <w:rPr>
+          <w:b/>
+          <w:bCs/>
+          <w:sz w:val="22"/>
+          <w:szCs w:val="22"/>
+        </w:rPr>
+        <w:t xml:space="preserve">Conversion pipeline</w:t>
+      </w:r>
+      <w:r>
+        <w:rPr>
+          <w:sz w:val="22"/>
+          <w:szCs w:val="22"/>
+        </w:rPr>
+        <w:t xml:space="preserve"> shows which steps are done and the </w:t>
+      </w:r>
+      <w:r>
+        <w:rPr>
+          <w:b/>
+          <w:bCs/>
+          <w:sz w:val="22"/>
+          <w:szCs w:val="22"/>
+        </w:rPr>
+        <w:t xml:space="preserve">Next</w:t>
+      </w:r>
+      <w:r>
+        <w:rPr>
+          <w:sz w:val="22"/>
+          <w:szCs w:val="22"/>
+        </w:rPr>
+        <w:t xml:space="preserve"> action button.</w:t>
+      </w:r>
+    </w:p>
+    <w:p>
+      <w:pPr>
+        <w:pStyle w:val="ListParagraph"/>
+        <w:numPr>
+          <w:ilvl w:val="0"/>
+          <w:numId w:val="2"/>
+        </w:numPr>
+        <w:spacing w:after="60"/>
+      </w:pPr>
+      <w:r>
+        <w:rPr>
+          <w:sz w:val="22"/>
+          <w:szCs w:val="22"/>
+        </w:rPr>
+        <w:t xml:space="preserve">Select </w:t>
       </w:r>
       <w:r>
         <w:rPr>
@@ -10297,7 +10623,7 @@
           <w:sz w:val="22"/>
           <w:szCs w:val="22"/>
         </w:rPr>
-        <w:t xml:space="preserve"> (AI).</w:t>
+        <w:t xml:space="preserve"> (or use Next). Review the summary; you can regenerate later.</w:t>
       </w:r>
     </w:p>
     <w:p>
@@ -10311,6 +10637,13 @@
       </w:pPr>
       <w:r>
         <w:rPr>
+          <w:sz w:val="22"/>
+          <w:szCs w:val="22"/>
+        </w:rPr>
+        <w:t xml:space="preserve">Select </w:t>
+      </w:r>
+      <w:r>
+        <w:rPr>
           <w:b/>
           <w:bCs/>
           <w:sz w:val="22"/>
@@ -10323,7 +10656,7 @@
           <w:sz w:val="22"/>
           <w:szCs w:val="22"/>
         </w:rPr>
-        <w:t xml:space="preserve"> — rich-text (WYSIWYG) editor; </w:t>
+        <w:t xml:space="preserve">. Edit the proposal title and body in the WYSIWYG editor, then </w:t>
       </w:r>
       <w:r>
         <w:rPr>
@@ -10339,6 +10672,22 @@
           <w:sz w:val="22"/>
           <w:szCs w:val="22"/>
         </w:rPr>
+        <w:t xml:space="preserve">. Optionally </w:t>
+      </w:r>
+      <w:r>
+        <w:rPr>
+          <w:b/>
+          <w:bCs/>
+          <w:sz w:val="22"/>
+          <w:szCs w:val="22"/>
+        </w:rPr>
+        <w:t xml:space="preserve">Export proposal PDF</w:t>
+      </w:r>
+      <w:r>
+        <w:rPr>
+          <w:sz w:val="22"/>
+          <w:szCs w:val="22"/>
+        </w:rPr>
         <w:t xml:space="preserve">.</w:t>
       </w:r>
     </w:p>
@@ -10353,19 +10702,26 @@
       </w:pPr>
       <w:r>
         <w:rPr>
-          <w:b/>
-          <w:bCs/>
-          <w:sz w:val="22"/>
-          <w:szCs w:val="22"/>
-        </w:rPr>
-        <w:t xml:space="preserve">Export proposal PDF</w:t>
-      </w:r>
-      <w:r>
-        <w:rPr>
-          <w:sz w:val="22"/>
-          <w:szCs w:val="22"/>
-        </w:rPr>
-        <w:t xml:space="preserve"> — opens a print-ready page (use browser Print → Save as PDF).</w:t>
+          <w:sz w:val="22"/>
+          <w:szCs w:val="22"/>
+        </w:rPr>
+        <w:t xml:space="preserve">Select </w:t>
+      </w:r>
+      <w:r>
+        <w:rPr>
+          <w:b/>
+          <w:bCs/>
+          <w:sz w:val="22"/>
+          <w:szCs w:val="22"/>
+        </w:rPr>
+        <w:t xml:space="preserve">Generate FRs</w:t>
+      </w:r>
+      <w:r>
+        <w:rPr>
+          <w:sz w:val="22"/>
+          <w:szCs w:val="22"/>
+        </w:rPr>
+        <w:t xml:space="preserve">. Review the list (epic / feature / story / task / subtask hints).</w:t>
       </w:r>
     </w:p>
     <w:p>
@@ -10379,19 +10735,58 @@
       </w:pPr>
       <w:r>
         <w:rPr>
-          <w:b/>
-          <w:bCs/>
-          <w:sz w:val="22"/>
-          <w:szCs w:val="22"/>
-        </w:rPr>
-        <w:t xml:space="preserve">Generate FRs</w:t>
-      </w:r>
-      <w:r>
-        <w:rPr>
-          <w:sz w:val="22"/>
-          <w:szCs w:val="22"/>
-        </w:rPr>
-        <w:t xml:space="preserve"> — functional requirements with kind hints (epic / feature / story / task / subtask).</w:t>
+          <w:sz w:val="22"/>
+          <w:szCs w:val="22"/>
+        </w:rPr>
+        <w:t xml:space="preserve">Choose a </w:t>
+      </w:r>
+      <w:r>
+        <w:rPr>
+          <w:b/>
+          <w:bCs/>
+          <w:sz w:val="22"/>
+          <w:szCs w:val="22"/>
+        </w:rPr>
+        <w:t xml:space="preserve">Target project</w:t>
+      </w:r>
+      <w:r>
+        <w:rPr>
+          <w:sz w:val="22"/>
+          <w:szCs w:val="22"/>
+        </w:rPr>
+        <w:t xml:space="preserve"> and select </w:t>
+      </w:r>
+      <w:r>
+        <w:rPr>
+          <w:b/>
+          <w:bCs/>
+          <w:sz w:val="22"/>
+          <w:szCs w:val="22"/>
+        </w:rPr>
+        <w:t xml:space="preserve">Create epic / feature / task hierarchy</w:t>
+      </w:r>
+      <w:r>
+        <w:rPr>
+          <w:sz w:val="22"/>
+          <w:szCs w:val="22"/>
+        </w:rPr>
+        <w:t xml:space="preserve"> (or </w:t>
+      </w:r>
+      <w:r>
+        <w:rPr>
+          <w:b/>
+          <w:bCs/>
+          <w:sz w:val="22"/>
+          <w:szCs w:val="22"/>
+        </w:rPr>
+        <w:t xml:space="preserve">Push to backlog</w:t>
+      </w:r>
+      <w:r>
+        <w:rPr>
+          <w:sz w:val="22"/>
+          <w:szCs w:val="22"/>
+        </w:rPr>
+        <w:t xml:space="preserve"> in Next). Existing backlog items are not deleted; new items are added.</w:t>
       </w:r>
     </w:p>
     <w:p>
@@ -10405,19 +10800,26 @@
       </w:pPr>
       <w:r>
         <w:rPr>
-          <w:b/>
-          <w:bCs/>
-          <w:sz w:val="22"/>
-          <w:szCs w:val="22"/>
-        </w:rPr>
-        <w:t xml:space="preserve">Push to project backlog</w:t>
-      </w:r>
-      <w:r>
-        <w:rPr>
-          <w:sz w:val="22"/>
-          <w:szCs w:val="22"/>
-        </w:rPr>
-        <w:t xml:space="preserve"> — selects a company project and creates hierarchy items. Existing backlog items are not deleted.</w:t>
+          <w:sz w:val="22"/>
+          <w:szCs w:val="22"/>
+        </w:rPr>
+        <w:t xml:space="preserve">From the notes list anytime, use </w:t>
+      </w:r>
+      <w:r>
+        <w:rPr>
+          <w:b/>
+          <w:bCs/>
+          <w:sz w:val="22"/>
+          <w:szCs w:val="22"/>
+        </w:rPr>
+        <w:t xml:space="preserve">Open &amp; convert</w:t>
+      </w:r>
+      <w:r>
+        <w:rPr>
+          <w:sz w:val="22"/>
+          <w:szCs w:val="22"/>
+        </w:rPr>
+        <w:t xml:space="preserve"> to return to this pipeline.</w:t>
       </w:r>
     </w:p>
     <w:p>
@@ -10443,23 +10845,19 @@
           <w:sz w:val="22"/>
           <w:szCs w:val="22"/>
         </w:rPr>
-        <w:t xml:space="preserve"> — start/end/timezone/location → </w:t>
-      </w:r>
-      <w:r>
-        <w:rPr>
-          <w:b/>
-          <w:bCs/>
-          <w:sz w:val="22"/>
-          <w:szCs w:val="22"/>
-        </w:rPr>
-        <w:t xml:space="preserve">Download ICS</w:t>
-      </w:r>
-      <w:r>
-        <w:rPr>
-          <w:sz w:val="22"/>
-          <w:szCs w:val="22"/>
-        </w:rPr>
-        <w:t xml:space="preserve"> for any calendar app. Google Calendar OAuth is optional via env and is not required.</w:t>
+        <w:t xml:space="preserve"> (optional):</w:t>
+      </w:r>
+    </w:p>
+    <w:p>
+      <w:pPr>
+        <w:spacing w:after="120"/>
+      </w:pPr>
+      <w:r>
+        <w:rPr>
+          <w:sz w:val="22"/>
+          <w:szCs w:val="22"/>
+        </w:rPr>
+        <w:t xml:space="preserve">Plain textareas are no longer used for notes or proposal bodies — both use the shared rich-text editor.</w:t>
       </w:r>
     </w:p>
     <w:p>
@@ -10653,7 +11051,7 @@
           <w:sz w:val="22"/>
           <w:szCs w:val="22"/>
         </w:rPr>
-        <w:t xml:space="preserve">Sign in with the same email/password as the web app (separate mobile token API — web sessions unchanged).</w:t>
+        <w:t xml:space="preserve">Sign in with the same email/password as the web app (separate mobile token API — web sessions unchanged). Production API URL is baked into the app.</w:t>
       </w:r>
     </w:p>
     <w:p>
@@ -10684,10 +11082,35 @@
       </w:pPr>
       <w:r>
         <w:rPr>
-          <w:sz w:val="22"/>
-          <w:szCs w:val="22"/>
-        </w:rPr>
-        <w:t xml:space="preserve">Overview KPIs, Projects, Meeting Notes (list/create). Full AI proposal/FR pipeline remains on the web detail page.</w:t>
+          <w:b/>
+          <w:bCs/>
+          <w:sz w:val="22"/>
+          <w:szCs w:val="22"/>
+        </w:rPr>
+        <w:t xml:space="preserve">Overview</w:t>
+      </w:r>
+      <w:r>
+        <w:rPr>
+          <w:sz w:val="22"/>
+          <w:szCs w:val="22"/>
+        </w:rPr>
+        <w:t xml:space="preserve"> KPIs and </w:t>
+      </w:r>
+      <w:r>
+        <w:rPr>
+          <w:b/>
+          <w:bCs/>
+          <w:sz w:val="22"/>
+          <w:szCs w:val="22"/>
+        </w:rPr>
+        <w:t xml:space="preserve">Projects</w:t>
+      </w:r>
+      <w:r>
+        <w:rPr>
+          <w:sz w:val="22"/>
+          <w:szCs w:val="22"/>
+        </w:rPr>
+        <w:t xml:space="preserve">.</w:t>
       </w:r>
     </w:p>
     <w:p>
@@ -10701,10 +11124,130 @@
       </w:pPr>
       <w:r>
         <w:rPr>
-          <w:sz w:val="22"/>
-          <w:szCs w:val="22"/>
-        </w:rPr>
-        <w:t xml:space="preserve">Install Android: see </w:t>
+          <w:b/>
+          <w:bCs/>
+          <w:sz w:val="22"/>
+          <w:szCs w:val="22"/>
+        </w:rPr>
+        <w:t xml:space="preserve">Meeting Notes</w:t>
+      </w:r>
+      <w:r>
+        <w:rPr>
+          <w:sz w:val="22"/>
+          <w:szCs w:val="22"/>
+        </w:rPr>
+        <w:t xml:space="preserve">: list/create with rich-text (Quill), open detail for the full pipeline (summary → proposal → FRs → push backlog) and schedule with the same date/time dropdowns and Meet/Teams options as web.</w:t>
+      </w:r>
+    </w:p>
+    <w:p>
+      <w:pPr>
+        <w:pStyle w:val="ListParagraph"/>
+        <w:numPr>
+          <w:ilvl w:val="0"/>
+          <w:numId w:val="1"/>
+        </w:numPr>
+        <w:spacing w:after="60"/>
+      </w:pPr>
+      <w:r>
+        <w:rPr>
+          <w:b/>
+          <w:bCs/>
+          <w:sz w:val="22"/>
+          <w:szCs w:val="22"/>
+        </w:rPr>
+        <w:t xml:space="preserve">Billing</w:t>
+      </w:r>
+      <w:r>
+        <w:rPr>
+          <w:sz w:val="22"/>
+          <w:szCs w:val="22"/>
+        </w:rPr>
+        <w:t xml:space="preserve">: month view, account/project rollups, optional working-days override when you have edit permission.</w:t>
+      </w:r>
+    </w:p>
+    <w:p>
+      <w:pPr>
+        <w:pStyle w:val="ListParagraph"/>
+        <w:numPr>
+          <w:ilvl w:val="0"/>
+          <w:numId w:val="1"/>
+        </w:numPr>
+        <w:spacing w:after="60"/>
+      </w:pPr>
+      <w:r>
+        <w:rPr>
+          <w:b/>
+          <w:bCs/>
+          <w:sz w:val="22"/>
+          <w:szCs w:val="22"/>
+        </w:rPr>
+        <w:t xml:space="preserve">GTS Report</w:t>
+      </w:r>
+      <w:r>
+        <w:rPr>
+          <w:sz w:val="22"/>
+          <w:szCs w:val="22"/>
+        </w:rPr>
+        <w:t xml:space="preserve">: pick account/month, generate/refresh, edit header fields, view lines.</w:t>
+      </w:r>
+    </w:p>
+    <w:p>
+      <w:pPr>
+        <w:pStyle w:val="ListParagraph"/>
+        <w:numPr>
+          <w:ilvl w:val="0"/>
+          <w:numId w:val="1"/>
+        </w:numPr>
+        <w:spacing w:after="60"/>
+      </w:pPr>
+      <w:r>
+        <w:rPr>
+          <w:b/>
+          <w:bCs/>
+          <w:sz w:val="22"/>
+          <w:szCs w:val="22"/>
+        </w:rPr>
+        <w:t xml:space="preserve">AI Agent</w:t>
+      </w:r>
+      <w:r>
+        <w:rPr>
+          <w:sz w:val="22"/>
+          <w:szCs w:val="22"/>
+        </w:rPr>
+        <w:t xml:space="preserve">: list jobs and </w:t>
+      </w:r>
+      <w:r>
+        <w:rPr>
+          <w:b/>
+          <w:bCs/>
+          <w:sz w:val="22"/>
+          <w:szCs w:val="22"/>
+        </w:rPr>
+        <w:t xml:space="preserve">Run now</w:t>
+      </w:r>
+      <w:r>
+        <w:rPr>
+          <w:sz w:val="22"/>
+          <w:szCs w:val="22"/>
+        </w:rPr>
+        <w:t xml:space="preserve"> when you have run-agent permission.</w:t>
+      </w:r>
+    </w:p>
+    <w:p>
+      <w:pPr>
+        <w:pStyle w:val="ListParagraph"/>
+        <w:numPr>
+          <w:ilvl w:val="0"/>
+          <w:numId w:val="1"/>
+        </w:numPr>
+        <w:spacing w:after="60"/>
+      </w:pPr>
+      <w:r>
+        <w:rPr>
+          <w:sz w:val="22"/>
+          <w:szCs w:val="22"/>
+        </w:rPr>
+        <w:t xml:space="preserve">Install Android: </w:t>
       </w:r>
       <w:r>
         <w:rPr>
@@ -10712,14 +11255,14 @@
           <w:sz w:val="20"/>
           <w:szCs w:val="20"/>
         </w:rPr>
-        <w:t xml:space="preserve">mobile/README.md</w:t>
-      </w:r>
-      <w:r>
-        <w:rPr>
-          <w:sz w:val="22"/>
-          <w:szCs w:val="22"/>
-        </w:rPr>
-        <w:t xml:space="preserve"> and </w:t>
+        <w:t xml:space="preserve">mobile/dist/AI_Scrum_Master-release.apk</w:t>
+      </w:r>
+      <w:r>
+        <w:rPr>
+          <w:sz w:val="22"/>
+          <w:szCs w:val="22"/>
+        </w:rPr>
+        <w:t xml:space="preserve"> after a release build (see </w:t>
       </w:r>
       <w:r>
         <w:rPr>
@@ -10727,14 +11270,14 @@
           <w:sz w:val="20"/>
           <w:szCs w:val="20"/>
         </w:rPr>
-        <w:t xml:space="preserve">mobile/build/app/outputs/flutter-apk/app-release.apk</w:t>
-      </w:r>
-      <w:r>
-        <w:rPr>
-          <w:sz w:val="22"/>
-          <w:szCs w:val="22"/>
-        </w:rPr>
-        <w:t xml:space="preserve"> after release build.</w:t>
+        <w:t xml:space="preserve">mobile/README.md</w:t>
+      </w:r>
+      <w:r>
+        <w:rPr>
+          <w:sz w:val="22"/>
+          <w:szCs w:val="22"/>
+        </w:rPr>
+        <w:t xml:space="preserve">).</w:t>
       </w:r>
     </w:p>
     <w:p>

</xml_diff>